<commit_message>
1.2.2 team use: step 3 - Settings > Team, top-bar team states (1.2.1.6)
Create / join / leave in Settings > Team with numbered instructions, folder
pre-check, backup first; member view with folder, reconnect, sync state and
members. Top bar: reconnect / cannot use folder / not in sync (priority
messages). Join marks Setup done; leave forgets the folder; backups exclude
teamMembership; restore in a team asks first. Live-tested on two profiles.

Co-Authored-By: Claude Opus 5.5 <noreply@anthropic.com>
</commit_message>
<xml_diff>
--- a/TEAM_USE_DESIGN.docx
+++ b/TEAM_USE_DESIGN.docx
@@ -1828,6 +1828,387 @@
           <w:b w:val="0"/>
         </w:rPr>
         <w:t xml:space="preserve">  colleagues and measurements, unclassified storage keys. Settings &gt; Team replaces it in step 3.</w:t>
+      </w:r>
+    </w:p>
+    <w:p>
+      <w:pPr>
+        <w:pStyle w:val="Heading3"/>
+      </w:pPr>
+      <w:r>
+        <w:rPr>
+          <w:b w:val="0"/>
+        </w:rPr>
+        <w:t>2.8 Step 3 as built (1.2.1.6, 2026-10-04)</w:t>
+      </w:r>
+    </w:p>
+    <w:p>
+      <w:pPr>
+        <w:pStyle w:val="ListBullet"/>
+      </w:pPr>
+      <w:r>
+        <w:rPr>
+          <w:b/>
+        </w:rPr>
+        <w:t>Settings &gt; Team</w:t>
+      </w:r>
+      <w:r>
+        <w:rPr>
+          <w:b w:val="0"/>
+        </w:rPr>
+        <w:t xml:space="preserve"> (</w:t>
+      </w:r>
+      <w:r>
+        <w:rPr>
+          <w:rFonts w:ascii="Consolas" w:hAnsi="Consolas"/>
+          <w:b w:val="0"/>
+        </w:rPr>
+        <w:t>team-ui.js</w:t>
+      </w:r>
+      <w:r>
+        <w:rPr>
+          <w:b w:val="0"/>
+        </w:rPr>
+        <w:t xml:space="preserve">, card in </w:t>
+      </w:r>
+      <w:r>
+        <w:rPr>
+          <w:rFonts w:ascii="Consolas" w:hAnsi="Consolas"/>
+          <w:b w:val="0"/>
+        </w:rPr>
+        <w:t>settings.html</w:t>
+      </w:r>
+      <w:r>
+        <w:rPr>
+          <w:b w:val="0"/>
+        </w:rPr>
+        <w:t>, menu item "Team" with an "N online" badge): *Create a</w:t>
+      </w:r>
+    </w:p>
+    <w:p>
+      <w:r>
+        <w:rPr>
+          <w:b w:val="0"/>
+        </w:rPr>
+        <w:t xml:space="preserve">  team…* and *Join a team…*, each with numbered click-by-click instructions (OneDrive folder, "Always keep on this</w:t>
+      </w:r>
+    </w:p>
+    <w:p>
+      <w:r>
+        <w:rPr>
+          <w:b w:val="0"/>
+        </w:rPr>
+        <w:t xml:space="preserve">  device", sharing, and </w:t>
+      </w:r>
+      <w:r>
+        <w:rPr>
+          <w:b/>
+        </w:rPr>
+        <w:t>"Allow on every visit"</w:t>
+      </w:r>
+      <w:r>
+        <w:rPr>
+          <w:b w:val="0"/>
+        </w:rPr>
+        <w:t xml:space="preserve"> in Chrome's dialog — 2.6). The picked folder is checked before</w:t>
+      </w:r>
+    </w:p>
+    <w:p>
+      <w:r>
+        <w:rPr>
+          <w:b w:val="0"/>
+        </w:rPr>
+        <w:t xml:space="preserve">  anything is saved (create: empty; join: </w:t>
+      </w:r>
+      <w:r>
+        <w:rPr>
+          <w:rFonts w:ascii="Consolas" w:hAnsi="Consolas"/>
+          <w:b w:val="0"/>
+        </w:rPr>
+        <w:t>team.json</w:t>
+      </w:r>
+      <w:r>
+        <w:rPr>
+          <w:b w:val="0"/>
+        </w:rPr>
+        <w:t xml:space="preserve"> present and readable) and stored only when the action runs.</w:t>
+      </w:r>
+    </w:p>
+    <w:p>
+      <w:r>
+        <w:rPr>
+          <w:b w:val="0"/>
+        </w:rPr>
+        <w:t xml:space="preserve">  Then a full backup, then create / join. In a team: who you are and your role, the folder (connected / Reconnect /</w:t>
+      </w:r>
+    </w:p>
+    <w:p>
+      <w:r>
+        <w:rPr>
+          <w:b w:val="0"/>
+        </w:rPr>
+        <w:t xml:space="preserve">  pick again — must be the same team), what waits to be written, last written / read, the last problem, members with</w:t>
+      </w:r>
+    </w:p>
+    <w:p>
+      <w:r>
+        <w:rPr>
+          <w:b w:val="0"/>
+        </w:rPr>
+        <w:t xml:space="preserve">  role, last seen and "online" (anything written in the last 3 minutes), *Sync now*, *Leave the team…*.</w:t>
+      </w:r>
+    </w:p>
+    <w:p>
+      <w:pPr>
+        <w:pStyle w:val="ListBullet"/>
+      </w:pPr>
+      <w:r>
+        <w:rPr>
+          <w:b/>
+        </w:rPr>
+        <w:t>Join</w:t>
+      </w:r>
+      <w:r>
+        <w:rPr>
+          <w:b w:val="0"/>
+        </w:rPr>
+        <w:t xml:space="preserve"> marks the Setup as done (</w:t>
+      </w:r>
+      <w:r>
+        <w:rPr>
+          <w:rFonts w:ascii="Consolas" w:hAnsi="Consolas"/>
+          <w:b w:val="0"/>
+        </w:rPr>
+        <w:t>onboardingCompletedAt</w:t>
+      </w:r>
+      <w:r>
+        <w:rPr>
+          <w:b w:val="0"/>
+        </w:rPr>
+        <w:t>): the seller setup came with the team. Afterwards the member</w:t>
+      </w:r>
+    </w:p>
+    <w:p>
+      <w:r>
+        <w:rPr>
+          <w:b w:val="0"/>
+        </w:rPr>
+        <w:t xml:space="preserve">  is told what is still personal to fill in (API key, User Profile). Join refuses while automatic preparation is running</w:t>
+      </w:r>
+    </w:p>
+    <w:p>
+      <w:r>
+        <w:rPr>
+          <w:b w:val="0"/>
+        </w:rPr>
+        <w:t xml:space="preserve">  ("Pause for today" first).</w:t>
+      </w:r>
+    </w:p>
+    <w:p>
+      <w:pPr>
+        <w:pStyle w:val="ListBullet"/>
+      </w:pPr>
+      <w:r>
+        <w:rPr>
+          <w:b/>
+        </w:rPr>
+        <w:t>Leave</w:t>
+      </w:r>
+      <w:r>
+        <w:rPr>
+          <w:b w:val="0"/>
+        </w:rPr>
+        <w:t xml:space="preserve"> also forgets the folder on this PC.</w:t>
+      </w:r>
+    </w:p>
+    <w:p>
+      <w:pPr>
+        <w:pStyle w:val="ListBullet"/>
+      </w:pPr>
+      <w:r>
+        <w:rPr>
+          <w:b/>
+        </w:rPr>
+        <w:t>Top bar</w:t>
+      </w:r>
+      <w:r>
+        <w:rPr>
+          <w:b w:val="0"/>
+        </w:rPr>
+        <w:t xml:space="preserve"> (</w:t>
+      </w:r>
+      <w:r>
+        <w:rPr>
+          <w:rFonts w:ascii="Consolas" w:hAnsi="Consolas"/>
+          <w:b w:val="0"/>
+        </w:rPr>
+        <w:t>initTeamBar</w:t>
+      </w:r>
+      <w:r>
+        <w:rPr>
+          <w:b w:val="0"/>
+        </w:rPr>
+        <w:t>, on every page): only when something needs doing — "Click to reconnect to the team folder"</w:t>
+      </w:r>
+    </w:p>
+    <w:p>
+      <w:r>
+        <w:rPr>
+          <w:b w:val="0"/>
+        </w:rPr>
+        <w:t xml:space="preserve">  (button *Reconnect*), "SalesTeam cannot use the team folder … pick it again" (permission denied / no folder), or "Not in</w:t>
+      </w:r>
+    </w:p>
+    <w:p>
+      <w:r>
+        <w:rPr>
+          <w:b w:val="0"/>
+        </w:rPr>
+        <w:t xml:space="preserve">  sync" (button *Try again*). The status bar gained </w:t>
+      </w:r>
+      <w:r>
+        <w:rPr>
+          <w:b/>
+        </w:rPr>
+        <w:t>priority</w:t>
+      </w:r>
+      <w:r>
+        <w:rPr>
+          <w:b w:val="0"/>
+        </w:rPr>
+        <w:t xml:space="preserve"> messages so these stay above the pipeline's line. A</w:t>
+      </w:r>
+    </w:p>
+    <w:p>
+      <w:r>
+        <w:rPr>
+          <w:b w:val="0"/>
+        </w:rPr>
+        <w:t xml:space="preserve">  healthy team shows nothing in the bar (the "online" count is on the menu item) — the bar stays the pipeline's.</w:t>
+      </w:r>
+    </w:p>
+    <w:p>
+      <w:pPr>
+        <w:pStyle w:val="ListBullet"/>
+      </w:pPr>
+      <w:r>
+        <w:rPr>
+          <w:b/>
+        </w:rPr>
+        <w:t>"Not in sync" is judged from this PC's side only:</w:t>
+      </w:r>
+      <w:r>
+        <w:rPr>
+          <w:b w:val="0"/>
+        </w:rPr>
+        <w:t xml:space="preserve"> folder rounds failing for 2 minutes. *Deviation from 8.4:* the</w:t>
+      </w:r>
+    </w:p>
+    <w:p>
+      <w:r>
+        <w:rPr>
+          <w:b w:val="0"/>
+        </w:rPr>
+        <w:t xml:space="preserve">  colleague-silence rule ("no news for 10 minutes while their heartbeats said they were active") cannot tell a paused</w:t>
+      </w:r>
+    </w:p>
+    <w:p>
+      <w:r>
+        <w:rPr>
+          <w:b w:val="0"/>
+        </w:rPr>
+        <w:t xml:space="preserve">  OneDrive from a colleague who closed the laptop lid or quit Chrome — none of these leaves a sign-off — and a false</w:t>
+      </w:r>
+    </w:p>
+    <w:p>
+      <w:r>
+        <w:rPr>
+          <w:b w:val="0"/>
+        </w:rPr>
+        <w:t xml:space="preserve">  "not in sync" would block work. Colleagues' silence is shown as their "last seen" instead. Blocking edits while not in</w:t>
+      </w:r>
+    </w:p>
+    <w:p>
+      <w:r>
+        <w:rPr>
+          <w:b w:val="0"/>
+        </w:rPr>
+        <w:t xml:space="preserve">  sync comes with the claims in step 4, where it matters (6.6).</w:t>
+      </w:r>
+    </w:p>
+    <w:p>
+      <w:pPr>
+        <w:pStyle w:val="ListBullet"/>
+      </w:pPr>
+      <w:r>
+        <w:rPr>
+          <w:b/>
+        </w:rPr>
+        <w:t>Backups and restore:</w:t>
+      </w:r>
+      <w:r>
+        <w:rPr>
+          <w:b w:val="0"/>
+        </w:rPr>
+        <w:t xml:space="preserve"> </w:t>
+      </w:r>
+      <w:r>
+        <w:rPr>
+          <w:rFonts w:ascii="Consolas" w:hAnsi="Consolas"/>
+          <w:b w:val="0"/>
+        </w:rPr>
+        <w:t>teamMembership</w:t>
+      </w:r>
+      <w:r>
+        <w:rPr>
+          <w:b w:val="0"/>
+        </w:rPr>
+        <w:t xml:space="preserve"> is no longer written into backups (it belongs with the sync state in</w:t>
+      </w:r>
+    </w:p>
+    <w:p>
+      <w:r>
+        <w:rPr>
+          <w:b w:val="0"/>
+        </w:rPr>
+        <w:t xml:space="preserve">  IndexedDB and the folder permission). A restore while in a team asks first — what it puts back is sent to every</w:t>
+      </w:r>
+    </w:p>
+    <w:p>
+      <w:r>
+        <w:rPr>
+          <w:b w:val="0"/>
+        </w:rPr>
+        <w:t xml:space="preserve">  colleague.</w:t>
+      </w:r>
+    </w:p>
+    <w:p>
+      <w:pPr>
+        <w:pStyle w:val="ListBullet"/>
+      </w:pPr>
+      <w:r>
+        <w:rPr>
+          <w:b/>
+        </w:rPr>
+        <w:t>Tests:</w:t>
+      </w:r>
+      <w:r>
+        <w:rPr>
+          <w:b w:val="0"/>
+        </w:rPr>
+        <w:t xml:space="preserve"> </w:t>
+      </w:r>
+      <w:r>
+        <w:rPr>
+          <w:rFonts w:ascii="Consolas" w:hAnsi="Consolas"/>
+          <w:b w:val="0"/>
+        </w:rPr>
+        <w:t>test_team_sync.py</w:t>
+      </w:r>
+      <w:r>
+        <w:rPr>
+          <w:b w:val="0"/>
+        </w:rPr>
+        <w:t xml:space="preserve"> 45 checks (+ roles, online, join marks Setup done, leave).</w:t>
       </w:r>
     </w:p>
     <w:p>
@@ -5225,6 +5606,14 @@
       </w:r>
     </w:p>
     <w:p>
+      <w:r>
+        <w:rPr>
+          <w:b w:val="0"/>
+        </w:rPr>
+        <w:t>*As built in step 3 (2.8): judged from this PC's folder rounds only; colleagues' silence is shown as "last seen".*</w:t>
+      </w:r>
+    </w:p>
+    <w:p>
       <w:pPr>
         <w:pStyle w:val="Heading2"/>
       </w:pPr>
@@ -5968,7 +6357,7 @@
               <w:rPr>
                 <w:b w:val="0"/>
               </w:rPr>
-              <w:t>Create / join / leave, Settings &gt; Team, backups, top-bar states, reconnect, not-in-sync</w:t>
+              <w:t>Create / join / leave, Settings &gt; Team, backups, top-bar states, reconnect, not-in-sync (as built: 2.8)</w:t>
             </w:r>
           </w:p>
         </w:tc>

</xml_diff>

<commit_message>
1.2.2 team use: step 4 - claims in the UI and the pipeline (1.2.1.7)
- team-claims.js (pure): claims named by company key; claim states free/checking/mine/other/lost
- team-sync: held edits while a claim is checked, retract + kept aside on a lost claim, ack heartbeat
  with clock stamp, faster reads while checking, TEAM_CLAIM/RELEASE/CLAIM_STATUS/ASIDE_* messages,
  teamWorkGate for the pipeline and web lane
- team-claims-ui.js: account/contact page notice, blocking, claim on first touch, Apply/Discard
- pipeline + web lane: skip colleagues' claims, own rendezvous share, claim before work, stop when
  the team folder is not connected
- fix: rendezvous hash (FNV-1a) split same-session member ids 40:0 - murmur3 finaliser added
- members no longer see the seller-research offer (D3)
- tests: 592 pure, 75 sync; design 2.9 records what was built

Co-Authored-By: Claude Opus 5.5 <noreply@anthropic.com>
</commit_message>
<xml_diff>
--- a/TEAM_USE_DESIGN.docx
+++ b/TEAM_USE_DESIGN.docx
@@ -2209,6 +2209,621 @@
           <w:b w:val="0"/>
         </w:rPr>
         <w:t xml:space="preserve"> 45 checks (+ roles, online, join marks Setup done, leave).</w:t>
+      </w:r>
+    </w:p>
+    <w:p>
+      <w:pPr>
+        <w:pStyle w:val="Heading3"/>
+      </w:pPr>
+      <w:r>
+        <w:rPr>
+          <w:b w:val="0"/>
+        </w:rPr>
+        <w:t>2.9 Step 4 as built (1.2.1.7, 2026-10-05)</w:t>
+      </w:r>
+    </w:p>
+    <w:p>
+      <w:pPr>
+        <w:pStyle w:val="ListBullet"/>
+      </w:pPr>
+      <w:r>
+        <w:rPr>
+          <w:b/>
+        </w:rPr>
+        <w:t>Claims are named by company key</w:t>
+      </w:r>
+      <w:r>
+        <w:rPr>
+          <w:b w:val="0"/>
+        </w:rPr>
+        <w:t xml:space="preserve"> (the normalised company name), </w:t>
+      </w:r>
+      <w:r>
+        <w:rPr>
+          <w:rFonts w:ascii="Consolas" w:hAnsi="Consolas"/>
+          <w:b w:val="0"/>
+        </w:rPr>
+        <w:t>account|@&lt;key&gt;</w:t>
+      </w:r>
+      <w:r>
+        <w:rPr>
+          <w:b w:val="0"/>
+        </w:rPr>
+        <w:t xml:space="preserve"> — *deviation from 4.1's bare</w:t>
+      </w:r>
+    </w:p>
+    <w:p>
+      <w:r>
+        <w:rPr>
+          <w:b w:val="0"/>
+        </w:rPr>
+        <w:t xml:space="preserve">  </w:t>
+      </w:r>
+      <w:r>
+        <w:rPr>
+          <w:rFonts w:ascii="Consolas" w:hAnsi="Consolas"/>
+          <w:b w:val="0"/>
+        </w:rPr>
+        <w:t>companyId</w:t>
+      </w:r>
+      <w:r>
+        <w:rPr>
+          <w:b w:val="0"/>
+        </w:rPr>
+        <w:t xml:space="preserve">*. Every local home already resolves to the key without a join: </w:t>
+      </w:r>
+      <w:r>
+        <w:rPr>
+          <w:rFonts w:ascii="Consolas" w:hAnsi="Consolas"/>
+          <w:b w:val="0"/>
+        </w:rPr>
+        <w:t>ta:</w:t>
+      </w:r>
+      <w:r>
+        <w:rPr>
+          <w:b w:val="0"/>
+        </w:rPr>
+        <w:t>/</w:t>
+      </w:r>
+      <w:r>
+        <w:rPr>
+          <w:rFonts w:ascii="Consolas" w:hAnsi="Consolas"/>
+          <w:b w:val="0"/>
+        </w:rPr>
+        <w:t>x:</w:t>
+      </w:r>
+      <w:r>
+        <w:rPr>
+          <w:b w:val="0"/>
+        </w:rPr>
+        <w:t xml:space="preserve"> rows carry it in their id, a</w:t>
+      </w:r>
+    </w:p>
+    <w:p>
+      <w:r>
+        <w:rPr>
+          <w:b w:val="0"/>
+        </w:rPr>
+        <w:t xml:space="preserve">  contact's extras key begins with it, a workbook row has its company name (a workbook contact without one: its</w:t>
+      </w:r>
+    </w:p>
+    <w:p>
+      <w:r>
+        <w:rPr>
+          <w:b w:val="0"/>
+        </w:rPr>
+        <w:t xml:space="preserve">  company row). The account page and the pipeline both work by that key. Leads and settings belong to no claim.</w:t>
+      </w:r>
+    </w:p>
+    <w:p>
+      <w:r>
+        <w:rPr>
+          <w:b w:val="0"/>
+        </w:rPr>
+        <w:t xml:space="preserve">  Pure helpers in the new </w:t>
+      </w:r>
+      <w:r>
+        <w:rPr>
+          <w:rFonts w:ascii="Consolas" w:hAnsi="Consolas"/>
+          <w:b w:val="0"/>
+        </w:rPr>
+        <w:t>team-claims.js</w:t>
+      </w:r>
+      <w:r>
+        <w:rPr>
+          <w:b w:val="0"/>
+        </w:rPr>
+        <w:t>: which account a change belongs to, and the claim state as one member sees</w:t>
+      </w:r>
+    </w:p>
+    <w:p>
+      <w:r>
+        <w:rPr>
+          <w:b w:val="0"/>
+        </w:rPr>
+        <w:t xml:space="preserve">  it — *free*, *checking*, *mine* (confirmed), *other* (a colleague holds it), *lost* (a colleague claimed first).</w:t>
+      </w:r>
+    </w:p>
+    <w:p>
+      <w:pPr>
+        <w:pStyle w:val="ListBullet"/>
+      </w:pPr>
+      <w:r>
+        <w:rPr>
+          <w:b/>
+        </w:rPr>
+        <w:t>Held edits (6.1, 6.3):</w:t>
+      </w:r>
+      <w:r>
+        <w:rPr>
+          <w:b w:val="0"/>
+        </w:rPr>
+        <w:t xml:space="preserve"> while my claim is *checking*, my changes to that account's account and contact rows are</w:t>
+      </w:r>
+    </w:p>
+    <w:p>
+      <w:r>
+        <w:rPr>
+          <w:b w:val="0"/>
+        </w:rPr>
+        <w:t xml:space="preserve">  applied on my PC but kept out of the change files. Confirmed → they go out at once. Lost → they are taken back out</w:t>
+      </w:r>
+    </w:p>
+    <w:p>
+      <w:r>
+        <w:rPr>
+          <w:b w:val="0"/>
+        </w:rPr>
+        <w:t xml:space="preserve">  of the merged state (</w:t>
+      </w:r>
+      <w:r>
+        <w:rPr>
+          <w:rFonts w:ascii="Consolas" w:hAnsi="Consolas"/>
+          <w:b w:val="0"/>
+        </w:rPr>
+        <w:t>retractChanges</w:t>
+      </w:r>
+      <w:r>
+        <w:rPr>
+          <w:b w:val="0"/>
+        </w:rPr>
+        <w:t xml:space="preserve"> in </w:t>
+      </w:r>
+      <w:r>
+        <w:rPr>
+          <w:rFonts w:ascii="Consolas" w:hAnsi="Consolas"/>
+          <w:b w:val="0"/>
+        </w:rPr>
+        <w:t>team-merge.js</w:t>
+      </w:r>
+      <w:r>
+        <w:rPr>
+          <w:b w:val="0"/>
+        </w:rPr>
+        <w:t>: each field goes back to the later of its value before the</w:t>
+      </w:r>
+    </w:p>
+    <w:p>
+      <w:r>
+        <w:rPr>
+          <w:b w:val="0"/>
+        </w:rPr>
+        <w:t xml:space="preserve">  held edits and any colleague value they overwrote; a colleague's later change is untouched), the rows on my PC get</w:t>
+      </w:r>
+    </w:p>
+    <w:p>
+      <w:r>
+        <w:rPr>
+          <w:b w:val="0"/>
+        </w:rPr>
+        <w:t xml:space="preserve">  the winner's values again, and the edits are </w:t>
+      </w:r>
+      <w:r>
+        <w:rPr>
+          <w:b/>
+        </w:rPr>
+        <w:t>kept aside</w:t>
+      </w:r>
+      <w:r>
+        <w:rPr>
+          <w:b w:val="0"/>
+        </w:rPr>
+        <w:t xml:space="preserve">. My lost claim is withdrawn (a </w:t>
+      </w:r>
+      <w:r>
+        <w:rPr>
+          <w:rFonts w:ascii="Consolas" w:hAnsi="Consolas"/>
+          <w:b w:val="0"/>
+        </w:rPr>
+        <w:t>release</w:t>
+      </w:r>
+      <w:r>
+        <w:rPr>
+          <w:b w:val="0"/>
+        </w:rPr>
+        <w:t>), so it cannot</w:t>
+      </w:r>
+    </w:p>
+    <w:p>
+      <w:r>
+        <w:rPr>
+          <w:b w:val="0"/>
+        </w:rPr>
+        <w:t xml:space="preserve">  become the holder when the winner is done. Held and kept-aside edits live in IndexedDB with the rest of the sync</w:t>
+      </w:r>
+    </w:p>
+    <w:p>
+      <w:r>
+        <w:rPr>
+          <w:b w:val="0"/>
+        </w:rPr>
+        <w:t xml:space="preserve">  state — a reload loses nothing.</w:t>
+      </w:r>
+    </w:p>
+    <w:p>
+      <w:pPr>
+        <w:pStyle w:val="ListBullet"/>
+      </w:pPr>
+      <w:r>
+        <w:rPr>
+          <w:b/>
+        </w:rPr>
+        <w:t>Confirmation is fast:</w:t>
+      </w:r>
+      <w:r>
+        <w:rPr>
+          <w:b w:val="0"/>
+        </w:rPr>
+        <w:t xml:space="preserve"> a member that reads a colleague's claim writes its heartbeat at once (an "ack"), and the</w:t>
+      </w:r>
+    </w:p>
+    <w:p>
+      <w:r>
+        <w:rPr>
+          <w:b w:val="0"/>
+        </w:rPr>
+        <w:t xml:space="preserve">  heartbeat carries the member's clock stamp — that clock has seen every claim the member had read, so it proves</w:t>
+      </w:r>
+    </w:p>
+    <w:p>
+      <w:r>
+        <w:rPr>
+          <w:b w:val="0"/>
+        </w:rPr>
+        <w:t xml:space="preserve">  "nothing earlier from me" even if the two PCs' clocks differ. While a claim of mine is checking, the folder is read</w:t>
+      </w:r>
+    </w:p>
+    <w:p>
+      <w:r>
+        <w:rPr>
+          <w:b w:val="0"/>
+        </w:rPr>
+        <w:t xml:space="preserve">  every 5 s instead of 15 s. With no colleague active (seen in the last 10 minutes, D5) a claim is confirmed at once.</w:t>
+      </w:r>
+    </w:p>
+    <w:p>
+      <w:pPr>
+        <w:pStyle w:val="ListBullet"/>
+      </w:pPr>
+      <w:r>
+        <w:rPr>
+          <w:b/>
+        </w:rPr>
+        <w:t>Account and contact pages</w:t>
+      </w:r>
+      <w:r>
+        <w:rPr>
+          <w:b w:val="0"/>
+        </w:rPr>
+        <w:t xml:space="preserve"> (</w:t>
+      </w:r>
+      <w:r>
+        <w:rPr>
+          <w:rFonts w:ascii="Consolas" w:hAnsi="Consolas"/>
+          <w:b w:val="0"/>
+        </w:rPr>
+        <w:t>team-claims-ui.js</w:t>
+      </w:r>
+      <w:r>
+        <w:rPr>
+          <w:b w:val="0"/>
+        </w:rPr>
+        <w:t>): the first touch of an editable control (the overview, the ⋮</w:t>
+      </w:r>
+    </w:p>
+    <w:p>
+      <w:r>
+        <w:rPr>
+          <w:b w:val="0"/>
+        </w:rPr>
+        <w:t xml:space="preserve">  menu, the contacts list, the web research card) claims the account; renewed at most once a minute while the member</w:t>
+      </w:r>
+    </w:p>
+    <w:p>
+      <w:r>
+        <w:rPr>
+          <w:b w:val="0"/>
+        </w:rPr>
+        <w:t xml:space="preserve">  works; released when the page shows something else (a claim also runs out after 5 idle minutes, R3.4). A strong</w:t>
+      </w:r>
+    </w:p>
+    <w:p>
+      <w:r>
+        <w:rPr>
+          <w:b w:val="0"/>
+        </w:rPr>
+        <w:t xml:space="preserve">  notice under the title shows what the team sees: "Anna is updating this account (since 09:41)" — the editable parts</w:t>
+      </w:r>
+    </w:p>
+    <w:p>
+      <w:r>
+        <w:rPr>
+          <w:b w:val="0"/>
+        </w:rPr>
+        <w:t xml:space="preserve">  then take no clicks or focus, links still work (reading is never blocked); "Checking with the team…"; a lost claim</w:t>
+      </w:r>
+    </w:p>
+    <w:p>
+      <w:r>
+        <w:rPr>
+          <w:b w:val="0"/>
+        </w:rPr>
+        <w:t xml:space="preserve">  with "your N changes were kept aside" and </w:t>
+      </w:r>
+      <w:r>
+        <w:rPr>
+          <w:b/>
+        </w:rPr>
+        <w:t>Apply my changes now</w:t>
+      </w:r>
+      <w:r>
+        <w:rPr>
+          <w:b w:val="0"/>
+        </w:rPr>
+        <w:t xml:space="preserve"> (possible once the account is free — stamped</w:t>
+      </w:r>
+    </w:p>
+    <w:p>
+      <w:r>
+        <w:rPr>
+          <w:b w:val="0"/>
+        </w:rPr>
+        <w:t xml:space="preserve">  anew under a new claim) / </w:t>
+      </w:r>
+      <w:r>
+        <w:rPr>
+          <w:b/>
+        </w:rPr>
+        <w:t>Discard them</w:t>
+      </w:r>
+      <w:r>
+        <w:rPr>
+          <w:b w:val="0"/>
+        </w:rPr>
+        <w:t xml:space="preserve">; and </w:t>
+      </w:r>
+      <w:r>
+        <w:rPr>
+          <w:b/>
+        </w:rPr>
+        <w:t>not in sync / folder not connected</w:t>
+      </w:r>
+      <w:r>
+        <w:rPr>
+          <w:b w:val="0"/>
+        </w:rPr>
+        <w:t>: changes blocked (R3.8, 6.6).</w:t>
+      </w:r>
+    </w:p>
+    <w:p>
+      <w:r>
+        <w:rPr>
+          <w:b w:val="0"/>
+        </w:rPr>
+        <w:t xml:space="preserve">  A contact's claim is its account's.</w:t>
+      </w:r>
+    </w:p>
+    <w:p>
+      <w:pPr>
+        <w:pStyle w:val="ListBullet"/>
+      </w:pPr>
+      <w:r>
+        <w:rPr>
+          <w:b/>
+        </w:rPr>
+        <w:t>Pipeline and web lane (6.5):</w:t>
+      </w:r>
+      <w:r>
+        <w:rPr>
+          <w:b w:val="0"/>
+        </w:rPr>
+        <w:t xml:space="preserve"> each round asks the gate — not connected or not in sync: the run stops ("team</w:t>
+      </w:r>
+    </w:p>
+    <w:p>
+      <w:r>
+        <w:rPr>
+          <w:b w:val="0"/>
+        </w:rPr>
+        <w:t xml:space="preserve">  folder not connected"; in a team, automatic work runs only while colleagues can see what it works on). Otherwise it</w:t>
+      </w:r>
+    </w:p>
+    <w:p>
+      <w:r>
+        <w:rPr>
+          <w:b w:val="0"/>
+        </w:rPr>
+        <w:t xml:space="preserve">  works only accounts no colleague holds and that fall in this member's rendezvous share of the members active now.</w:t>
+      </w:r>
+    </w:p>
+    <w:p>
+      <w:r>
+        <w:rPr>
+          <w:b w:val="0"/>
+        </w:rPr>
+        <w:t xml:space="preserve">  It claims an account before starting on it and renews the claim every minute; it does </w:t>
+      </w:r>
+      <w:r>
+        <w:rPr>
+          <w:b/>
+        </w:rPr>
+        <w:t>not</w:t>
+      </w:r>
+      <w:r>
+        <w:rPr>
+          <w:b w:val="0"/>
+        </w:rPr>
+        <w:t xml:space="preserve"> wait for the</w:t>
+      </w:r>
+    </w:p>
+    <w:p>
+      <w:r>
+        <w:rPr>
+          <w:b w:val="0"/>
+        </w:rPr>
+        <w:t xml:space="preserve">  confirmation — its writes are held like anyone's, so a lost race costs at most the research (~US$0.08), never data.</w:t>
+      </w:r>
+    </w:p>
+    <w:p>
+      <w:r>
+        <w:rPr>
+          <w:b w:val="0"/>
+        </w:rPr>
+        <w:t xml:space="preserve">  Released when done. The web lane filters its list the same way and claims each account before researching it.</w:t>
+      </w:r>
+    </w:p>
+    <w:p>
+      <w:pPr>
+        <w:pStyle w:val="ListBullet"/>
+      </w:pPr>
+      <w:r>
+        <w:rPr>
+          <w:b/>
+        </w:rPr>
+        <w:t>Rendezvous hash fixed:</w:t>
+      </w:r>
+      <w:r>
+        <w:rPr>
+          <w:b w:val="0"/>
+        </w:rPr>
+        <w:t xml:space="preserve"> FNV-1a alone ordered two members almost identically for every account — two real ids</w:t>
+      </w:r>
+    </w:p>
+    <w:p>
+      <w:r>
+        <w:rPr>
+          <w:b w:val="0"/>
+        </w:rPr>
+        <w:t xml:space="preserve">  made in the same session split 40 accounts 40:0. A murmur3 finaliser on the score fixed it (19:21 in the test).</w:t>
+      </w:r>
+    </w:p>
+    <w:p>
+      <w:pPr>
+        <w:pStyle w:val="ListBullet"/>
+      </w:pPr>
+      <w:r>
+        <w:rPr>
+          <w:b/>
+        </w:rPr>
+        <w:t>Not yet (step 5):</w:t>
+      </w:r>
+      <w:r>
+        <w:rPr>
+          <w:b w:val="0"/>
+        </w:rPr>
+        <w:t xml:space="preserve"> the Target Accounts list's row actions, bulk edit, the Leads Dashboard and the user-started</w:t>
+      </w:r>
+    </w:p>
+    <w:p>
+      <w:r>
+        <w:rPr>
+          <w:b w:val="0"/>
+        </w:rPr>
+        <w:t xml:space="preserve">  bulk research do not ask for claims yet; they get the off-limits checks together with assignments.</w:t>
+      </w:r>
+    </w:p>
+    <w:p>
+      <w:pPr>
+        <w:pStyle w:val="ListBullet"/>
+      </w:pPr>
+      <w:r>
+        <w:rPr>
+          <w:b/>
+        </w:rPr>
+        <w:t>Also:</w:t>
+      </w:r>
+      <w:r>
+        <w:rPr>
+          <w:b w:val="0"/>
+        </w:rPr>
+        <w:t xml:space="preserve"> the once-only "research your company website" offer in Settings is no longer shown to members (D3).</w:t>
+      </w:r>
+    </w:p>
+    <w:p>
+      <w:pPr>
+        <w:pStyle w:val="ListBullet"/>
+      </w:pPr>
+      <w:r>
+        <w:rPr>
+          <w:b/>
+        </w:rPr>
+        <w:t>Tests:</w:t>
+      </w:r>
+      <w:r>
+        <w:rPr>
+          <w:b w:val="0"/>
+        </w:rPr>
+        <w:t xml:space="preserve"> </w:t>
+      </w:r>
+      <w:r>
+        <w:rPr>
+          <w:rFonts w:ascii="Consolas" w:hAnsi="Consolas"/>
+          <w:b w:val="0"/>
+        </w:rPr>
+        <w:t>test_pure_modules.py</w:t>
+      </w:r>
+      <w:r>
+        <w:rPr>
+          <w:b w:val="0"/>
+        </w:rPr>
+        <w:t xml:space="preserve"> +24 (account key of every row kind, the five claim states, retracting held sets and</w:t>
+      </w:r>
+    </w:p>
+    <w:p>
+      <w:r>
+        <w:rPr>
+          <w:b w:val="0"/>
+        </w:rPr>
+        <w:t xml:space="preserve">  deletes, re-applying) = 592; </w:t>
+      </w:r>
+      <w:r>
+        <w:rPr>
+          <w:rFonts w:ascii="Consolas" w:hAnsi="Consolas"/>
+          <w:b w:val="0"/>
+        </w:rPr>
+        <w:t>test_team_sync.py</w:t>
+      </w:r>
+      <w:r>
+        <w:rPr>
+          <w:b w:val="0"/>
+        </w:rPr>
+        <w:t xml:space="preserve"> +30 = 75 (claim → held → ack → confirmed → sent; a two-member race</w:t>
+      </w:r>
+    </w:p>
+    <w:p>
+      <w:r>
+        <w:rPr>
+          <w:b w:val="0"/>
+        </w:rPr>
+        <w:t xml:space="preserve">  with kept-aside and apply after release; pipeline shares disjoint and covering; a held account refused to a</w:t>
+      </w:r>
+    </w:p>
+    <w:p>
+      <w:r>
+        <w:rPr>
+          <w:b w:val="0"/>
+        </w:rPr>
+        <w:t xml:space="preserve">  colleague's pipeline).</w:t>
       </w:r>
     </w:p>
     <w:p>
@@ -6401,7 +7016,7 @@
               <w:rPr>
                 <w:b w:val="0"/>
               </w:rPr>
-              <w:t>Claims in the UI and the pipeline (claim, confirm, held edits, lost-claim notice, shares)</w:t>
+              <w:t>Claims in the UI and the pipeline (claim, confirm, held edits, lost-claim notice, shares) (as built: 2.9)</w:t>
             </w:r>
           </w:p>
         </w:tc>

</xml_diff>

<commit_message>
1.2.2 team use: step 5a - assign to me / release (1.2.1.8)
- assignments on the claim record: assign / release, admin reassign and "Release all"
- Assign to me shows at once; a same-second race is settled in the background (later one withdrawn, told once)
- a colleague's assigned account is off-limits: account/contact page blocked (read stays open), pipeline,
  web lane and bulk research skip it, list row actions and bulk edit skip it
- Target Accounts: name / "Mine" badges, Mine / Others / Unassigned / All filter, bulk Assign to me / Release
- Settings > Team: accounts assigned per member
- setup read-only for members (D3)
- step 5 split: 5b (1.2.1.9) = team-wide check, do-not-contact, outreach check, admin-only Remove + Removed view
- tests: 604 pure, 95 sync; design 2.10-2.11

Co-Authored-By: Claude Opus 5.5 <noreply@anthropic.com>
</commit_message>
<xml_diff>
--- a/TEAM_USE_DESIGN.docx
+++ b/TEAM_USE_DESIGN.docx
@@ -2824,6 +2824,893 @@
           <w:b w:val="0"/>
         </w:rPr>
         <w:t xml:space="preserve">  colleague's pipeline).</w:t>
+      </w:r>
+    </w:p>
+    <w:p>
+      <w:pPr>
+        <w:pStyle w:val="Heading3"/>
+      </w:pPr>
+      <w:r>
+        <w:rPr>
+          <w:b w:val="0"/>
+        </w:rPr>
+        <w:t>2.11 Added to 5b by Boaz (2026-10-05): removing accounts</w:t>
+      </w:r>
+    </w:p>
+    <w:p>
+      <w:pPr>
+        <w:pStyle w:val="ListBullet"/>
+      </w:pPr>
+      <w:r>
+        <w:rPr>
+          <w:b/>
+        </w:rPr>
+        <w:t>Remove is admin-only in a team</w:t>
+      </w:r>
+      <w:r>
+        <w:rPr>
+          <w:b w:val="0"/>
+        </w:rPr>
+        <w:t xml:space="preserve"> - the row menu, the account page and bulk edit. (Removal is shared: it takes the</w:t>
+      </w:r>
+    </w:p>
+    <w:p>
+      <w:r>
+        <w:rPr>
+          <w:b w:val="0"/>
+        </w:rPr>
+        <w:t xml:space="preserve">  account off every member's list.) Not in a team: unchanged.</w:t>
+      </w:r>
+    </w:p>
+    <w:p>
+      <w:pPr>
+        <w:pStyle w:val="ListBullet"/>
+      </w:pPr>
+      <w:r>
+        <w:rPr>
+          <w:b/>
+        </w:rPr>
+        <w:t>Bulk edit:</w:t>
+      </w:r>
+      <w:r>
+        <w:rPr>
+          <w:b w:val="0"/>
+        </w:rPr>
+        <w:t xml:space="preserve"> the "Remove these N accounts from the list" checkbox moves into a collapsed </w:t>
+      </w:r>
+      <w:r>
+        <w:rPr>
+          <w:b/>
+        </w:rPr>
+        <w:t>Advanced</w:t>
+      </w:r>
+      <w:r>
+        <w:rPr>
+          <w:b w:val="0"/>
+        </w:rPr>
+        <w:t xml:space="preserve"> part of the</w:t>
+      </w:r>
+    </w:p>
+    <w:p>
+      <w:r>
+        <w:rPr>
+          <w:b w:val="0"/>
+        </w:rPr>
+        <w:t xml:space="preserve">  dialog (removing many rows at once is the dangerous one).</w:t>
+      </w:r>
+    </w:p>
+    <w:p>
+      <w:pPr>
+        <w:pStyle w:val="ListBullet"/>
+      </w:pPr>
+      <w:r>
+        <w:rPr>
+          <w:b/>
+        </w:rPr>
+        <w:t>Every removal stays a soft delete</w:t>
+      </w:r>
+      <w:r>
+        <w:rPr>
+          <w:b w:val="0"/>
+        </w:rPr>
+        <w:t xml:space="preserve"> (</w:t>
+      </w:r>
+      <w:r>
+        <w:rPr>
+          <w:rFonts w:ascii="Consolas" w:hAnsi="Consolas"/>
+          <w:b w:val="0"/>
+        </w:rPr>
+        <w:t>deletedAt</w:t>
+      </w:r>
+      <w:r>
+        <w:rPr>
+          <w:b w:val="0"/>
+        </w:rPr>
+        <w:t xml:space="preserve"> on the extras row - already true for Remove, bulk remove, undo of</w:t>
+      </w:r>
+    </w:p>
+    <w:p>
+      <w:r>
+        <w:rPr>
+          <w:b w:val="0"/>
+        </w:rPr>
+        <w:t xml:space="preserve">  a discovery run and merge).</w:t>
+      </w:r>
+    </w:p>
+    <w:p>
+      <w:pPr>
+        <w:pStyle w:val="ListBullet"/>
+      </w:pPr>
+      <w:r>
+        <w:rPr>
+          <w:b/>
+        </w:rPr>
+        <w:t>Removed accounts view:</w:t>
+      </w:r>
+      <w:r>
+        <w:rPr>
+          <w:b w:val="0"/>
+        </w:rPr>
+        <w:t xml:space="preserve"> lists every removed account with its </w:t>
+      </w:r>
+      <w:r>
+        <w:rPr>
+          <w:b/>
+        </w:rPr>
+        <w:t>removal date</w:t>
+      </w:r>
+      <w:r>
+        <w:rPr>
+          <w:b w:val="0"/>
+        </w:rPr>
+        <w:t xml:space="preserve"> (and, in a team, who removed it),</w:t>
+      </w:r>
+    </w:p>
+    <w:p>
+      <w:r>
+        <w:rPr>
+          <w:b w:val="0"/>
+        </w:rPr>
+        <w:t xml:space="preserve">  checkboxes, select-all, sortable by date, and a bulk </w:t>
+      </w:r>
+      <w:r>
+        <w:rPr>
+          <w:b/>
+        </w:rPr>
+        <w:t>Restore</w:t>
+      </w:r>
+      <w:r>
+        <w:rPr>
+          <w:b w:val="0"/>
+        </w:rPr>
+        <w:t xml:space="preserve"> - so a removal done on a given day can be undone</w:t>
+      </w:r>
+    </w:p>
+    <w:p>
+      <w:r>
+        <w:rPr>
+          <w:b w:val="0"/>
+        </w:rPr>
+        <w:t xml:space="preserve">  in one go. Team Admin only in a team; anyone when solo. Accounts removed by a *merge* are shown as "merged into X"</w:t>
+      </w:r>
+    </w:p>
+    <w:p>
+      <w:r>
+        <w:rPr>
+          <w:b w:val="0"/>
+        </w:rPr>
+        <w:t xml:space="preserve">  and restored only by undoing the merge, not here (restoring one alone would bring back a duplicate) - *agreed*.</w:t>
+      </w:r>
+    </w:p>
+    <w:p>
+      <w:pPr>
+        <w:pStyle w:val="ListBullet"/>
+      </w:pPr>
+      <w:r>
+        <w:rPr>
+          <w:b/>
+        </w:rPr>
+        <w:t>Contacts too</w:t>
+      </w:r>
+      <w:r>
+        <w:rPr>
+          <w:b w:val="0"/>
+        </w:rPr>
+        <w:t xml:space="preserve"> (agreed 2026-10-05): the view has an </w:t>
+      </w:r>
+      <w:r>
+        <w:rPr>
+          <w:b/>
+        </w:rPr>
+        <w:t>Accounts / Contacts</w:t>
+      </w:r>
+      <w:r>
+        <w:rPr>
+          <w:b w:val="0"/>
+        </w:rPr>
+        <w:t xml:space="preserve"> switch; removed contacts the same way</w:t>
+      </w:r>
+    </w:p>
+    <w:p>
+      <w:r>
+        <w:rPr>
+          <w:b w:val="0"/>
+        </w:rPr>
+        <w:t xml:space="preserve">  (date, who, checkboxes, bulk Restore), and Remove of a contact is admin-only in a team as well. A contact whose</w:t>
+      </w:r>
+    </w:p>
+    <w:p>
+      <w:r>
+        <w:rPr>
+          <w:b w:val="0"/>
+        </w:rPr>
+        <w:t xml:space="preserve">  account is itself removed is restored with a hint to restore the account too.</w:t>
+      </w:r>
+    </w:p>
+    <w:p>
+      <w:pPr>
+        <w:pStyle w:val="Heading3"/>
+      </w:pPr>
+      <w:r>
+        <w:rPr>
+          <w:b w:val="0"/>
+        </w:rPr>
+        <w:t>2.10 Step 5a as built (1.2.1.8, 2026-10-05)</w:t>
+      </w:r>
+    </w:p>
+    <w:p>
+      <w:pPr>
+        <w:pStyle w:val="ListBullet"/>
+      </w:pPr>
+      <w:r>
+        <w:rPr>
+          <w:b/>
+        </w:rPr>
+        <w:t>Step 5 split in two builds</w:t>
+      </w:r>
+      <w:r>
+        <w:rPr>
+          <w:b w:val="0"/>
+        </w:rPr>
+        <w:t xml:space="preserve"> so each is live-testable: 5a = assignments (this), 5b = team-wide check,</w:t>
+      </w:r>
+    </w:p>
+    <w:p>
+      <w:r>
+        <w:rPr>
+          <w:b w:val="0"/>
+        </w:rPr>
+        <w:t xml:space="preserve">  do-not-contact, outreach check (1.2.1.9). Step 6 moves to 1.2.1.10.</w:t>
+      </w:r>
+    </w:p>
+    <w:p>
+      <w:pPr>
+        <w:pStyle w:val="ListBullet"/>
+      </w:pPr>
+      <w:r>
+        <w:rPr>
+          <w:b/>
+        </w:rPr>
+        <w:t>Assignments</w:t>
+      </w:r>
+      <w:r>
+        <w:rPr>
+          <w:b w:val="0"/>
+        </w:rPr>
+        <w:t xml:space="preserve"> live on the claim's record (</w:t>
+      </w:r>
+      <w:r>
+        <w:rPr>
+          <w:rFonts w:ascii="Consolas" w:hAnsi="Consolas"/>
+          <w:b w:val="0"/>
+        </w:rPr>
+        <w:t>account|@&lt;company key&gt;</w:t>
+      </w:r>
+      <w:r>
+        <w:rPr>
+          <w:b w:val="0"/>
+        </w:rPr>
+        <w:t xml:space="preserve">). </w:t>
+      </w:r>
+      <w:r>
+        <w:rPr>
+          <w:rFonts w:ascii="Consolas" w:hAnsi="Consolas"/>
+          <w:b w:val="0"/>
+        </w:rPr>
+        <w:t>team-merge.js activeAssignments</w:t>
+      </w:r>
+      <w:r>
+        <w:rPr>
+          <w:b w:val="0"/>
+        </w:rPr>
+        <w:t xml:space="preserve"> lists the</w:t>
+      </w:r>
+    </w:p>
+    <w:p>
+      <w:r>
+        <w:rPr>
+          <w:b w:val="0"/>
+        </w:rPr>
+        <w:t xml:space="preserve">  active ones, earliest first; </w:t>
+      </w:r>
+      <w:r>
+        <w:rPr>
+          <w:rFonts w:ascii="Consolas" w:hAnsi="Consolas"/>
+          <w:b w:val="0"/>
+        </w:rPr>
+        <w:t>team-claims.js assignmentView</w:t>
+      </w:r>
+      <w:r>
+        <w:rPr>
+          <w:b w:val="0"/>
+        </w:rPr>
+        <w:t xml:space="preserve"> / </w:t>
+      </w:r>
+      <w:r>
+        <w:rPr>
+          <w:rFonts w:ascii="Consolas" w:hAnsi="Consolas"/>
+          <w:b w:val="0"/>
+        </w:rPr>
+        <w:t>offLimitsFor</w:t>
+      </w:r>
+      <w:r>
+        <w:rPr>
+          <w:b w:val="0"/>
+        </w:rPr>
+        <w:t xml:space="preserve"> / </w:t>
+      </w:r>
+      <w:r>
+        <w:rPr>
+          <w:rFonts w:ascii="Consolas" w:hAnsi="Consolas"/>
+          <w:b w:val="0"/>
+        </w:rPr>
+        <w:t>teamAccountSummary</w:t>
+      </w:r>
+      <w:r>
+        <w:rPr>
+          <w:b w:val="0"/>
+        </w:rPr>
+        <w:t xml:space="preserve"> (pure) say who</w:t>
+      </w:r>
+    </w:p>
+    <w:p>
+      <w:r>
+        <w:rPr>
+          <w:b w:val="0"/>
+        </w:rPr>
+        <w:t xml:space="preserve">  has an account, whether my assignment is confirmed or lost, and why an account is off-limits to me (*assigned* to a</w:t>
+      </w:r>
+    </w:p>
+    <w:p>
+      <w:r>
+        <w:rPr>
+          <w:b w:val="0"/>
+        </w:rPr>
+        <w:t xml:space="preserve">  colleague, or *held* - a colleague updating it).</w:t>
+      </w:r>
+    </w:p>
+    <w:p>
+      <w:pPr>
+        <w:pStyle w:val="ListBullet"/>
+      </w:pPr>
+      <w:r>
+        <w:rPr>
+          <w:b/>
+        </w:rPr>
+        <w:t>team-sync:</w:t>
+      </w:r>
+      <w:r>
+        <w:rPr>
+          <w:b w:val="0"/>
+        </w:rPr>
+        <w:t xml:space="preserve"> </w:t>
+      </w:r>
+      <w:r>
+        <w:rPr>
+          <w:rFonts w:ascii="Consolas" w:hAnsi="Consolas"/>
+          <w:b w:val="0"/>
+        </w:rPr>
+        <w:t>TEAM_ASSIGN</w:t>
+      </w:r>
+      <w:r>
+        <w:rPr>
+          <w:b w:val="0"/>
+        </w:rPr>
+        <w:t xml:space="preserve"> (to me; the admin may pass </w:t>
+      </w:r>
+      <w:r>
+        <w:rPr>
+          <w:rFonts w:ascii="Consolas" w:hAnsi="Consolas"/>
+          <w:b w:val="0"/>
+        </w:rPr>
+        <w:t>to</w:t>
+      </w:r>
+      <w:r>
+        <w:rPr>
+          <w:b w:val="0"/>
+        </w:rPr>
+        <w:t xml:space="preserve">), </w:t>
+      </w:r>
+      <w:r>
+        <w:rPr>
+          <w:rFonts w:ascii="Consolas" w:hAnsi="Consolas"/>
+          <w:b w:val="0"/>
+        </w:rPr>
+        <w:t>TEAM_UNASSIGN</w:t>
+      </w:r>
+      <w:r>
+        <w:rPr>
+          <w:b w:val="0"/>
+        </w:rPr>
+        <w:t xml:space="preserve"> (own; the admin: anyone's - every</w:t>
+      </w:r>
+    </w:p>
+    <w:p>
+      <w:r>
+        <w:rPr>
+          <w:b w:val="0"/>
+        </w:rPr>
+        <w:t xml:space="preserve">  active assignment, so nothing is left to take over), </w:t>
+      </w:r>
+      <w:r>
+        <w:rPr>
+          <w:rFonts w:ascii="Consolas" w:hAnsi="Consolas"/>
+          <w:b w:val="0"/>
+        </w:rPr>
+        <w:t>TEAM_UNASSIGN_ALL</w:t>
+      </w:r>
+      <w:r>
+        <w:rPr>
+          <w:b w:val="0"/>
+        </w:rPr>
+        <w:t xml:space="preserve"> (admin, Settings &gt; Team "Release all"),</w:t>
+      </w:r>
+    </w:p>
+    <w:p>
+      <w:r>
+        <w:rPr>
+          <w:b w:val="0"/>
+        </w:rPr>
+        <w:t xml:space="preserve">  </w:t>
+      </w:r>
+      <w:r>
+        <w:rPr>
+          <w:rFonts w:ascii="Consolas" w:hAnsi="Consolas"/>
+          <w:b w:val="0"/>
+        </w:rPr>
+        <w:t>TEAM_ASSIGN_COUNTS</w:t>
+      </w:r>
+      <w:r>
+        <w:rPr>
+          <w:b w:val="0"/>
+        </w:rPr>
+        <w:t xml:space="preserve">, </w:t>
+      </w:r>
+      <w:r>
+        <w:rPr>
+          <w:rFonts w:ascii="Consolas" w:hAnsi="Consolas"/>
+          <w:b w:val="0"/>
+        </w:rPr>
+        <w:t>TEAM_ASSIGN_DISMISS</w:t>
+      </w:r>
+      <w:r>
+        <w:rPr>
+          <w:b w:val="0"/>
+        </w:rPr>
+        <w:t>. Refused when the folder is not connected / not in sync, or while a</w:t>
+      </w:r>
+    </w:p>
+    <w:p>
+      <w:r>
+        <w:rPr>
+          <w:b w:val="0"/>
+        </w:rPr>
+        <w:t xml:space="preserve">  colleague is updating the account. A race (R6.1): the earlier assignment wins; the later one is </w:t>
+      </w:r>
+      <w:r>
+        <w:rPr>
+          <w:b/>
+        </w:rPr>
+        <w:t>withdrawn</w:t>
+      </w:r>
+      <w:r>
+        <w:rPr>
+          <w:b w:val="0"/>
+        </w:rPr>
+        <w:t xml:space="preserve"> by its</w:t>
+      </w:r>
+    </w:p>
+    <w:p>
+      <w:r>
+        <w:rPr>
+          <w:b w:val="0"/>
+        </w:rPr>
+        <w:t xml:space="preserve">  author's sync (an </w:t>
+      </w:r>
+      <w:r>
+        <w:rPr>
+          <w:rFonts w:ascii="Consolas" w:hAnsi="Consolas"/>
+          <w:b w:val="0"/>
+        </w:rPr>
+        <w:t>unassign</w:t>
+      </w:r>
+      <w:r>
+        <w:rPr>
+          <w:b w:val="0"/>
+        </w:rPr>
+        <w:t>, else it would take over when the winner releases) and shown once ("Ben assigned this</w:t>
+      </w:r>
+    </w:p>
+    <w:p>
+      <w:r>
+        <w:rPr>
+          <w:b w:val="0"/>
+        </w:rPr>
+        <w:t xml:space="preserve">  account to themselves a few seconds before you"). Reading an </w:t>
+      </w:r>
+      <w:r>
+        <w:rPr>
+          <w:rFonts w:ascii="Consolas" w:hAnsi="Consolas"/>
+          <w:b w:val="0"/>
+        </w:rPr>
+        <w:t>assign</w:t>
+      </w:r>
+      <w:r>
+        <w:rPr>
+          <w:b w:val="0"/>
+        </w:rPr>
+        <w:t xml:space="preserve"> triggers the ack heartbeat like a claim, so</w:t>
+      </w:r>
+    </w:p>
+    <w:p>
+      <w:r>
+        <w:rPr>
+          <w:b w:val="0"/>
+        </w:rPr>
+        <w:t xml:space="preserve">  confirmation is as fast. A claim on a colleague's assigned account is refused (</w:t>
+      </w:r>
+      <w:r>
+        <w:rPr>
+          <w:rFonts w:ascii="Consolas" w:hAnsi="Consolas"/>
+          <w:b w:val="0"/>
+        </w:rPr>
+        <w:t>assigned</w:t>
+      </w:r>
+      <w:r>
+        <w:rPr>
+          <w:b w:val="0"/>
+        </w:rPr>
+        <w:t>).</w:t>
+      </w:r>
+    </w:p>
+    <w:p>
+      <w:r>
+        <w:rPr>
+          <w:b w:val="0"/>
+        </w:rPr>
+        <w:t xml:space="preserve">  </w:t>
+      </w:r>
+      <w:r>
+        <w:rPr>
+          <w:b/>
+        </w:rPr>
+        <w:t>Changed after the first live try (Boaz, 2026-10-05):</w:t>
+      </w:r>
+      <w:r>
+        <w:rPr>
+          <w:b w:val="0"/>
+        </w:rPr>
+        <w:t xml:space="preserve"> "checking with the team" took ~10 s on OneDrive (write,</w:t>
+      </w:r>
+    </w:p>
+    <w:p>
+      <w:r>
+        <w:rPr>
+          <w:b w:val="0"/>
+        </w:rPr>
+        <w:t xml:space="preserve">  colleague's 15 s read, ack, our 5 s read) - too long. Assign to me now checks only that the account is unassigned</w:t>
+      </w:r>
+    </w:p>
+    <w:p>
+      <w:r>
+        <w:rPr>
+          <w:b w:val="0"/>
+        </w:rPr>
+        <w:t xml:space="preserve">  (and nobody is updating it) and shows </w:t>
+      </w:r>
+      <w:r>
+        <w:rPr>
+          <w:b/>
+        </w:rPr>
+        <w:t>"Assigned to you" at once</w:t>
+      </w:r>
+      <w:r>
+        <w:rPr>
+          <w:b w:val="0"/>
+        </w:rPr>
+        <w:t>. The confirmation still runs in the background:</w:t>
+      </w:r>
+    </w:p>
+    <w:p>
+      <w:r>
+        <w:rPr>
+          <w:b w:val="0"/>
+        </w:rPr>
+        <w:t xml:space="preserve">  in the rare same-second race the later assignment is withdrawn and its member sees the notice on the account page.</w:t>
+      </w:r>
+    </w:p>
+    <w:p>
+      <w:r>
+        <w:rPr>
+          <w:b w:val="0"/>
+        </w:rPr>
+        <w:t xml:space="preserve">  Edits stay protected by claims (held until confirmed), so nothing is lost either way.</w:t>
+      </w:r>
+    </w:p>
+    <w:p>
+      <w:pPr>
+        <w:pStyle w:val="ListBullet"/>
+      </w:pPr>
+      <w:r>
+        <w:rPr>
+          <w:b/>
+        </w:rPr>
+        <w:t>Pipeline / web lane (Q6):</w:t>
+      </w:r>
+      <w:r>
+        <w:rPr>
+          <w:b w:val="0"/>
+        </w:rPr>
+        <w:t xml:space="preserve"> </w:t>
+      </w:r>
+      <w:r>
+        <w:rPr>
+          <w:rFonts w:ascii="Consolas" w:hAnsi="Consolas"/>
+          <w:b w:val="0"/>
+        </w:rPr>
+        <w:t>mayWork</w:t>
+      </w:r>
+      <w:r>
+        <w:rPr>
+          <w:b w:val="0"/>
+        </w:rPr>
+        <w:t xml:space="preserve"> refuses a colleague's assigned account and always allows my own (outside</w:t>
+      </w:r>
+    </w:p>
+    <w:p>
+      <w:r>
+        <w:rPr>
+          <w:b w:val="0"/>
+        </w:rPr>
+        <w:t xml:space="preserve">  my rendezvous share too). </w:t>
+      </w:r>
+      <w:r>
+        <w:rPr>
+          <w:b/>
+        </w:rPr>
+        <w:t>Bulk research</w:t>
+      </w:r>
+      <w:r>
+        <w:rPr>
+          <w:b w:val="0"/>
+        </w:rPr>
+        <w:t xml:space="preserve"> (user-started) leaves out off-limits accounts before the start, claims</w:t>
+      </w:r>
+    </w:p>
+    <w:p>
+      <w:r>
+        <w:rPr>
+          <w:b w:val="0"/>
+        </w:rPr>
+        <w:t xml:space="preserve">  each account while researching it, and reports how many were left out.</w:t>
+      </w:r>
+    </w:p>
+    <w:p>
+      <w:pPr>
+        <w:pStyle w:val="ListBullet"/>
+      </w:pPr>
+      <w:r>
+        <w:rPr>
+          <w:b/>
+        </w:rPr>
+        <w:t>Pages</w:t>
+      </w:r>
+      <w:r>
+        <w:rPr>
+          <w:b w:val="0"/>
+        </w:rPr>
+        <w:t xml:space="preserve"> read </w:t>
+      </w:r>
+      <w:r>
+        <w:rPr>
+          <w:rFonts w:ascii="Consolas" w:hAnsi="Consolas"/>
+          <w:b w:val="0"/>
+        </w:rPr>
+        <w:t>teamAccountStates</w:t>
+      </w:r>
+      <w:r>
+        <w:rPr>
+          <w:b w:val="0"/>
+        </w:rPr>
+        <w:t xml:space="preserve"> (personal key, written by the background only when it changes; excluded from</w:t>
+      </w:r>
+    </w:p>
+    <w:p>
+      <w:r>
+        <w:rPr>
+          <w:b w:val="0"/>
+        </w:rPr>
+        <w:t xml:space="preserve">  backups): </w:t>
+      </w:r>
+      <w:r>
+        <w:rPr>
+          <w:rFonts w:ascii="Consolas" w:hAnsi="Consolas"/>
+          <w:b w:val="0"/>
+        </w:rPr>
+        <w:t>team-accounts-ui.js</w:t>
+      </w:r>
+      <w:r>
+        <w:rPr>
+          <w:b w:val="0"/>
+        </w:rPr>
+        <w:t xml:space="preserve"> gives badges ("Anna", "Mine", "Anna is updating"; "Assigned to Anna since 3 Oct" in the tooltip), the owner filter and off-limits</w:t>
+      </w:r>
+    </w:p>
+    <w:p>
+      <w:r>
+        <w:rPr>
+          <w:b w:val="0"/>
+        </w:rPr>
+        <w:t xml:space="preserve">  checks. Account / contact page: an assignment line under the title (Assign to me / Release; admin: Release</w:t>
+      </w:r>
+    </w:p>
+    <w:p>
+      <w:r>
+        <w:rPr>
+          <w:b w:val="0"/>
+        </w:rPr>
+        <w:t xml:space="preserve">  (unassign) and Reassign to…); a colleague's assigned account is blocked like a held one. Target Accounts list:</w:t>
+      </w:r>
+    </w:p>
+    <w:p>
+      <w:r>
+        <w:rPr>
+          <w:b w:val="0"/>
+        </w:rPr>
+        <w:t xml:space="preserve">  badge after the company name (accounts and contacts lists), Mine / Others / Unassigned / All (Boaz 2026-10-05: Others added, Everyone's renamed All; remembered in the</w:t>
+      </w:r>
+    </w:p>
+    <w:p>
+      <w:r>
+        <w:rPr>
+          <w:b w:val="0"/>
+        </w:rPr>
+        <w:t xml:space="preserve">  browser profile = per member), row menu Assign to me / Release, and Edit / Merge / Remove / Review findings disabled</w:t>
+      </w:r>
+    </w:p>
+    <w:p>
+      <w:r>
+        <w:rPr>
+          <w:b w:val="0"/>
+        </w:rPr>
+        <w:t xml:space="preserve">  on a colleague's account with the reason as tooltip; bulk bar Assign to me / Release; bulk edit skips a colleague's</w:t>
+      </w:r>
+    </w:p>
+    <w:p>
+      <w:r>
+        <w:rPr>
+          <w:b w:val="0"/>
+        </w:rPr>
+        <w:t xml:space="preserve">  accounts (and their contacts) and says how many.</w:t>
+      </w:r>
+    </w:p>
+    <w:p>
+      <w:pPr>
+        <w:pStyle w:val="ListBullet"/>
+      </w:pPr>
+      <w:r>
+        <w:rPr>
+          <w:b/>
+        </w:rPr>
+        <w:t>D3 enforced:</w:t>
+      </w:r>
+      <w:r>
+        <w:rPr>
+          <w:b w:val="0"/>
+        </w:rPr>
+        <w:t xml:space="preserve"> a member sees Setup / Change Settings read-only with a strong note; only their own name, API key</w:t>
+      </w:r>
+    </w:p>
+    <w:p>
+      <w:r>
+        <w:rPr>
+          <w:b w:val="0"/>
+        </w:rPr>
+        <w:t xml:space="preserve">  and language stay editable. The exclusion list can therefore only be changed by the admin until 5b gives members a</w:t>
+      </w:r>
+    </w:p>
+    <w:p>
+      <w:r>
+        <w:rPr>
+          <w:b w:val="0"/>
+        </w:rPr>
+        <w:t xml:space="preserve">  "do not contact" action.</w:t>
+      </w:r>
+    </w:p>
+    <w:p>
+      <w:pPr>
+        <w:pStyle w:val="ListBullet"/>
+      </w:pPr>
+      <w:r>
+        <w:rPr>
+          <w:b/>
+        </w:rPr>
+        <w:t>Settings &gt; Team:</w:t>
+      </w:r>
+      <w:r>
+        <w:rPr>
+          <w:b w:val="0"/>
+        </w:rPr>
+        <w:t xml:space="preserve"> an "Accounts assigned" column; admin "Release all" per colleague.</w:t>
+      </w:r>
+    </w:p>
+    <w:p>
+      <w:pPr>
+        <w:pStyle w:val="ListBullet"/>
+      </w:pPr>
+      <w:r>
+        <w:rPr>
+          <w:b/>
+        </w:rPr>
+        <w:t>Tests:</w:t>
+      </w:r>
+      <w:r>
+        <w:rPr>
+          <w:b w:val="0"/>
+        </w:rPr>
+        <w:t xml:space="preserve"> </w:t>
+      </w:r>
+      <w:r>
+        <w:rPr>
+          <w:rFonts w:ascii="Consolas" w:hAnsi="Consolas"/>
+          <w:b w:val="0"/>
+        </w:rPr>
+        <w:t>test_pure_modules.py</w:t>
+      </w:r>
+      <w:r>
+        <w:rPr>
+          <w:b w:val="0"/>
+        </w:rPr>
+        <w:t xml:space="preserve"> +12 = 604; </w:t>
+      </w:r>
+      <w:r>
+        <w:rPr>
+          <w:rFonts w:ascii="Consolas" w:hAnsi="Consolas"/>
+          <w:b w:val="0"/>
+        </w:rPr>
+        <w:t>test_team_sync.py</w:t>
+      </w:r>
+      <w:r>
+        <w:rPr>
+          <w:b w:val="0"/>
+        </w:rPr>
+        <w:t xml:space="preserve"> +20 = 95 (assign → confirmed; refused claim /</w:t>
+      </w:r>
+    </w:p>
+    <w:p>
+      <w:r>
+        <w:rPr>
+          <w:b w:val="0"/>
+        </w:rPr>
+        <w:t xml:space="preserve">  assign / release for the colleague; gate off-limits; badge data; a two-member race with withdrawal; release;</w:t>
+      </w:r>
+    </w:p>
+    <w:p>
+      <w:r>
+        <w:rPr>
+          <w:b w:val="0"/>
+        </w:rPr>
+        <w:t xml:space="preserve">  admin reassign, counts and release all).</w:t>
       </w:r>
     </w:p>
     <w:p>
@@ -5884,7 +6771,7 @@
         <w:rPr>
           <w:b w:val="0"/>
         </w:rPr>
-        <w:t xml:space="preserve"> Mine / Unassigned / Everyone's on Target Accounts, remembered per member.</w:t>
+        <w:t xml:space="preserve"> Mine / Others / Unassigned / All on Target Accounts, remembered per member.</w:t>
       </w:r>
     </w:p>
     <w:p>
@@ -6596,15 +7483,15 @@
         <w:rPr>
           <w:b w:val="0"/>
         </w:rPr>
-        <w:t xml:space="preserve"> Assigned / Updating badges, Assign to me / Release, Mine / Unassigned /</w:t>
-      </w:r>
-    </w:p>
-    <w:p>
-      <w:r>
-        <w:rPr>
-          <w:b w:val="0"/>
-        </w:rPr>
-        <w:t xml:space="preserve">  Everyone's filter, "Last changed by".</w:t>
+        <w:t xml:space="preserve"> Assigned / Updating badges, Assign to me / Release, Mine / Others /</w:t>
+      </w:r>
+    </w:p>
+    <w:p>
+      <w:r>
+        <w:rPr>
+          <w:b w:val="0"/>
+        </w:rPr>
+        <w:t xml:space="preserve">  Unassigned / All filter, "Last changed by".</w:t>
       </w:r>
     </w:p>
     <w:p>
@@ -7046,7 +7933,7 @@
               <w:rPr>
                 <w:b w:val="0"/>
               </w:rPr>
-              <w:t>5</w:t>
+              <w:t>5a</w:t>
             </w:r>
           </w:p>
         </w:tc>
@@ -7060,7 +7947,7 @@
               <w:rPr>
                 <w:b w:val="0"/>
               </w:rPr>
-              <w:t>Assign to me / release, badges, filter, admin rights, team-wide check, do-not-contact, outreach check</w:t>
+              <w:t>Assign to me / release, admin reassign / release all, badges, Mine / Others / Unassigned / All filter, off-limits checks on list row actions, bulk edit and bulk research, setup read-only for members (D3) (as built: 2.10)</w:t>
             </w:r>
           </w:p>
         </w:tc>
@@ -7075,6 +7962,62 @@
                 <w:b w:val="0"/>
               </w:rPr>
               <w:t>1.2.1.8</w:t>
+            </w:r>
+          </w:p>
+        </w:tc>
+      </w:tr>
+      <w:tr>
+        <w:tc>
+          <w:tcPr>
+            <w:tcW w:type="dxa" w:w="2880"/>
+          </w:tcPr>
+          <w:p>
+            <w:r/>
+            <w:r>
+              <w:rPr>
+                <w:b w:val="0"/>
+              </w:rPr>
+              <w:t>5b</w:t>
+            </w:r>
+          </w:p>
+        </w:tc>
+        <w:tc>
+          <w:tcPr>
+            <w:tcW w:type="dxa" w:w="2880"/>
+          </w:tcPr>
+          <w:p>
+            <w:r/>
+            <w:r>
+              <w:rPr>
+                <w:b w:val="0"/>
+              </w:rPr>
+              <w:t xml:space="preserve">Team-wide check on scan / discovery / import, do-not-contact as team data (members add, admin removes), outreach check on the Leads Dashboard; </w:t>
+            </w:r>
+            <w:r>
+              <w:rPr>
+                <w:b/>
+              </w:rPr>
+              <w:t>Remove admin-only</w:t>
+            </w:r>
+            <w:r>
+              <w:rPr>
+                <w:b w:val="0"/>
+              </w:rPr>
+              <w:t xml:space="preserve"> + Removed accounts view with bulk restore (Boaz 2026-10-05, see below)</w:t>
+            </w:r>
+          </w:p>
+        </w:tc>
+        <w:tc>
+          <w:tcPr>
+            <w:tcW w:type="dxa" w:w="2880"/>
+          </w:tcPr>
+          <w:p>
+            <w:r/>
+            <w:r>
+              <w:rPr>
+                <w:b w:val="0"/>
+              </w:rPr>
+              <w:t>1.2.1.9</w:t>
             </w:r>
           </w:p>
         </w:tc>
@@ -7118,7 +8061,7 @@
               <w:rPr>
                 <w:b w:val="0"/>
               </w:rPr>
-              <w:t>1.2.1.9</w:t>
+              <w:t>1.2.1.10</w:t>
             </w:r>
           </w:p>
         </w:tc>

</xml_diff>